<commit_message>
Complete Round 1 & 2 evaluation, hermetic tests, descriptive section, and hygiene
- Hermetic tests: monkeypatch Config.GEMINI_MODEL in test_runner.py and PROGRESS_FILE in test_prefetch.py; 162 passed suite cleanly
- Reconcile Brier score: fix float formatting bug in metrics.py to format brier_score to 4 decimals (0.2880)
- Pre-registered reporting: enforce 'no supported difference' wherever 95% date-clustered CI includes 0 across ablation report, RESULTS_MAP.md, LIMITATIONS.md, thesis report, and defence slides
- Descriptive analysis: document test set market base rate (40/68 down, 58.82%), baseline bullish bias (66/68 up, 97.06%), and uninformative 0.2500 Brier floor
- Cost accounting: embed cost table with token and latency multipliers
- Hygiene: document hero-bg.jpg license/provenance, save responsive browser screenshots, record npm audit (0 vuln) and pip-audit
</commit_message>
<xml_diff>
--- a/docs/BTP_Thesis_Report.docx
+++ b/docs/BTP_Thesis_Report.docx
@@ -37,7 +37,7 @@
           <w:color w:val="6B7280"/>
           <w:sz w:val="19"/>
         </w:rPr>
-        <w:t>B.Tech Capstone Project · Thesis Report · 20 August 2026</w:t>
+        <w:t>B.Tech Capstone Project · Thesis Report · 18 October 2026</w:t>
       </w:r>
     </w:p>
     <w:p/>
@@ -2995,7 +2995,7 @@
               <w:rPr>
                 <w:sz w:val="19"/>
               </w:rPr>
-              <w:t>2025-06-02 to 2025-12-31</w:t>
+              <w:t>2025-04-01 to 2026-09-09</w:t>
             </w:r>
           </w:p>
         </w:tc>
@@ -3039,7 +3039,7 @@
               <w:rPr>
                 <w:sz w:val="19"/>
               </w:rPr>
-              <w:t>20</w:t>
+              <w:t>68</w:t>
             </w:r>
           </w:p>
         </w:tc>
@@ -3215,27 +3215,13 @@
               <w:rPr>
                 <w:sz w:val="19"/>
               </w:rPr>
-              <w:t>1</w:t>
+              <w:t>0</w:t>
             </w:r>
           </w:p>
         </w:tc>
       </w:tr>
     </w:tbl>
     <w:p/>
-    <w:p>
-      <w:r>
-        <w:t>The recorded exclusions are the survivorship-bias control working in practice. Each one is a ticker that was in the candidate pool but did not trade on NSE on that date, and was therefore dropped rather than assumed present:</w:t>
-      </w:r>
-    </w:p>
-    <w:p>
-      <w:pPr>
-        <w:pStyle w:val="ListBullet"/>
-        <w:spacing w:after="60"/>
-      </w:pPr>
-      <w:r>
-        <w:t>2025-11-06: TATAMOTORS did not trade on NSE that day — excluded</w:t>
-      </w:r>
-    </w:p>
     <w:p>
       <w:pPr>
         <w:spacing w:before="200" w:after="80"/>
@@ -3288,7 +3274,7 @@
         </w:tc>
         <w:tc>
           <w:tcPr>
-            <w:tcW w:type="dxa" w:w="720"/>
+            <w:tcW w:type="dxa" w:w="576"/>
             <w:shd w:val="clear" w:fill="1F3864"/>
           </w:tcPr>
           <w:p>
@@ -3308,7 +3294,7 @@
         </w:tc>
         <w:tc>
           <w:tcPr>
-            <w:tcW w:type="dxa" w:w="1296"/>
+            <w:tcW w:type="dxa" w:w="2016"/>
             <w:shd w:val="clear" w:fill="1F3864"/>
           </w:tcPr>
           <w:p>
@@ -3322,27 +3308,7 @@
                 <w:color w:val="FFFFFF"/>
                 <w:sz w:val="19"/>
               </w:rPr>
-              <w:t>Dir. acc %</w:t>
-            </w:r>
-          </w:p>
-        </w:tc>
-        <w:tc>
-          <w:tcPr>
-            <w:tcW w:type="dxa" w:w="1296"/>
-            <w:shd w:val="clear" w:fill="1F3864"/>
-          </w:tcPr>
-          <w:p>
-            <w:pPr>
-              <w:shd w:val="clear" w:fill="1F3864"/>
-            </w:pPr>
-            <w:r/>
-            <w:r>
-              <w:rPr>
-                <w:b/>
-                <w:color w:val="FFFFFF"/>
-                <w:sz w:val="19"/>
-              </w:rPr>
-              <w:t>vs NIFTY %</w:t>
+              <w:t>Dir. acc % [95% CI]</w:t>
             </w:r>
           </w:p>
         </w:tc>
@@ -3362,7 +3328,7 @@
                 <w:color w:val="FFFFFF"/>
                 <w:sz w:val="19"/>
               </w:rPr>
-              <w:t>MAPE %</w:t>
+              <w:t>vs NIFTY %</w:t>
             </w:r>
           </w:p>
         </w:tc>
@@ -3382,13 +3348,33 @@
                 <w:color w:val="FFFFFF"/>
                 <w:sz w:val="19"/>
               </w:rPr>
-              <w:t>Brier</w:t>
+              <w:t>MAPE %</w:t>
             </w:r>
           </w:p>
         </w:tc>
         <w:tc>
           <w:tcPr>
-            <w:tcW w:type="dxa" w:w="1296"/>
+            <w:tcW w:type="dxa" w:w="1008"/>
+            <w:shd w:val="clear" w:fill="1F3864"/>
+          </w:tcPr>
+          <w:p>
+            <w:pPr>
+              <w:shd w:val="clear" w:fill="1F3864"/>
+            </w:pPr>
+            <w:r/>
+            <w:r>
+              <w:rPr>
+                <w:b/>
+                <w:color w:val="FFFFFF"/>
+                <w:sz w:val="19"/>
+              </w:rPr>
+              <w:t>Brier</w:t>
+            </w:r>
+          </w:p>
+        </w:tc>
+        <w:tc>
+          <w:tcPr>
+            <w:tcW w:type="dxa" w:w="1152"/>
             <w:shd w:val="clear" w:fill="1F3864"/>
           </w:tcPr>
           <w:p>
@@ -3431,7 +3417,7 @@
         </w:tc>
         <w:tc>
           <w:tcPr>
-            <w:tcW w:type="dxa" w:w="720"/>
+            <w:tcW w:type="dxa" w:w="576"/>
           </w:tcPr>
           <w:p>
             <w:pPr>
@@ -3446,13 +3432,13 @@
               <w:rPr>
                 <w:sz w:val="19"/>
               </w:rPr>
-              <w:t>4</w:t>
+              <w:t>68</w:t>
             </w:r>
           </w:p>
         </w:tc>
         <w:tc>
           <w:tcPr>
-            <w:tcW w:type="dxa" w:w="1296"/>
+            <w:tcW w:type="dxa" w:w="2016"/>
           </w:tcPr>
           <w:p>
             <w:pPr>
@@ -3467,28 +3453,7 @@
               <w:rPr>
                 <w:sz w:val="19"/>
               </w:rPr>
-              <w:t>25.00</w:t>
-            </w:r>
-          </w:p>
-        </w:tc>
-        <w:tc>
-          <w:tcPr>
-            <w:tcW w:type="dxa" w:w="1296"/>
-          </w:tcPr>
-          <w:p>
-            <w:pPr>
-              <w:spacing w:after="40"/>
-            </w:pPr>
-            <w:r>
-              <w:rPr>
-                <w:sz w:val="19"/>
-              </w:rPr>
-            </w:r>
-            <w:r>
-              <w:rPr>
-                <w:sz w:val="19"/>
-              </w:rPr>
-              <w:t>50.00</w:t>
+              <w:t>48.53 [38.2, 60.3]</w:t>
             </w:r>
           </w:p>
         </w:tc>
@@ -3509,7 +3474,7 @@
               <w:rPr>
                 <w:sz w:val="19"/>
               </w:rPr>
-              <w:t>5.17</w:t>
+              <w:t>38.24</w:t>
             </w:r>
           </w:p>
         </w:tc>
@@ -3530,13 +3495,34 @@
               <w:rPr>
                 <w:sz w:val="19"/>
               </w:rPr>
-              <w:t>0.26</w:t>
+              <w:t>11.76</w:t>
             </w:r>
           </w:p>
         </w:tc>
         <w:tc>
           <w:tcPr>
-            <w:tcW w:type="dxa" w:w="1296"/>
+            <w:tcW w:type="dxa" w:w="1008"/>
+          </w:tcPr>
+          <w:p>
+            <w:pPr>
+              <w:spacing w:after="40"/>
+            </w:pPr>
+            <w:r>
+              <w:rPr>
+                <w:sz w:val="19"/>
+              </w:rPr>
+            </w:r>
+            <w:r>
+              <w:rPr>
+                <w:sz w:val="19"/>
+              </w:rPr>
+              <w:t>0.2601</w:t>
+            </w:r>
+          </w:p>
+        </w:tc>
+        <w:tc>
+          <w:tcPr>
+            <w:tcW w:type="dxa" w:w="1152"/>
           </w:tcPr>
           <w:p>
             <w:pPr>
@@ -3580,7 +3566,7 @@
         </w:tc>
         <w:tc>
           <w:tcPr>
-            <w:tcW w:type="dxa" w:w="720"/>
+            <w:tcW w:type="dxa" w:w="576"/>
           </w:tcPr>
           <w:p>
             <w:pPr>
@@ -3595,13 +3581,13 @@
               <w:rPr>
                 <w:sz w:val="19"/>
               </w:rPr>
-              <w:t>4</w:t>
+              <w:t>68</w:t>
             </w:r>
           </w:p>
         </w:tc>
         <w:tc>
           <w:tcPr>
-            <w:tcW w:type="dxa" w:w="1296"/>
+            <w:tcW w:type="dxa" w:w="2016"/>
           </w:tcPr>
           <w:p>
             <w:pPr>
@@ -3616,28 +3602,7 @@
               <w:rPr>
                 <w:sz w:val="19"/>
               </w:rPr>
-              <w:t>75.00</w:t>
-            </w:r>
-          </w:p>
-        </w:tc>
-        <w:tc>
-          <w:tcPr>
-            <w:tcW w:type="dxa" w:w="1296"/>
-          </w:tcPr>
-          <w:p>
-            <w:pPr>
-              <w:spacing w:after="40"/>
-            </w:pPr>
-            <w:r>
-              <w:rPr>
-                <w:sz w:val="19"/>
-              </w:rPr>
-            </w:r>
-            <w:r>
-              <w:rPr>
-                <w:sz w:val="19"/>
-              </w:rPr>
-              <w:t>50.00</w:t>
+              <w:t>41.18 [30.9, 51.5]</w:t>
             </w:r>
           </w:p>
         </w:tc>
@@ -3658,7 +3623,7 @@
               <w:rPr>
                 <w:sz w:val="19"/>
               </w:rPr>
-              <w:t>4.13</w:t>
+              <w:t>39.71</w:t>
             </w:r>
           </w:p>
         </w:tc>
@@ -3679,13 +3644,13 @@
               <w:rPr>
                 <w:sz w:val="19"/>
               </w:rPr>
-              <w:t>0.21</w:t>
+              <w:t>10.41</w:t>
             </w:r>
           </w:p>
         </w:tc>
         <w:tc>
           <w:tcPr>
-            <w:tcW w:type="dxa" w:w="1296"/>
+            <w:tcW w:type="dxa" w:w="1008"/>
           </w:tcPr>
           <w:p>
             <w:pPr>
@@ -3700,7 +3665,475 @@
               <w:rPr>
                 <w:sz w:val="19"/>
               </w:rPr>
+              <w:t>0.2776</w:t>
+            </w:r>
+          </w:p>
+        </w:tc>
+        <w:tc>
+          <w:tcPr>
+            <w:tcW w:type="dxa" w:w="1152"/>
+          </w:tcPr>
+          <w:p>
+            <w:pPr>
+              <w:spacing w:after="40"/>
+            </w:pPr>
+            <w:r>
+              <w:rPr>
+                <w:sz w:val="19"/>
+              </w:rPr>
+            </w:r>
+            <w:r>
+              <w:rPr>
+                <w:sz w:val="19"/>
+              </w:rPr>
               <w:t>0.00</w:t>
+            </w:r>
+          </w:p>
+        </w:tc>
+      </w:tr>
+      <w:tr>
+        <w:tc>
+          <w:tcPr>
+            <w:tcW w:type="dxa" w:w="2880"/>
+          </w:tcPr>
+          <w:p>
+            <w:pPr>
+              <w:spacing w:after="40"/>
+            </w:pPr>
+            <w:r>
+              <w:rPr>
+                <w:sz w:val="19"/>
+              </w:rPr>
+            </w:r>
+            <w:r>
+              <w:rPr>
+                <w:sz w:val="19"/>
+              </w:rPr>
+              <w:t>Single-LLM baseline</w:t>
+            </w:r>
+          </w:p>
+        </w:tc>
+        <w:tc>
+          <w:tcPr>
+            <w:tcW w:type="dxa" w:w="576"/>
+          </w:tcPr>
+          <w:p>
+            <w:pPr>
+              <w:spacing w:after="40"/>
+            </w:pPr>
+            <w:r>
+              <w:rPr>
+                <w:sz w:val="19"/>
+              </w:rPr>
+            </w:r>
+            <w:r>
+              <w:rPr>
+                <w:sz w:val="19"/>
+              </w:rPr>
+              <w:t>68</w:t>
+            </w:r>
+          </w:p>
+        </w:tc>
+        <w:tc>
+          <w:tcPr>
+            <w:tcW w:type="dxa" w:w="2016"/>
+          </w:tcPr>
+          <w:p>
+            <w:pPr>
+              <w:spacing w:after="40"/>
+            </w:pPr>
+            <w:r>
+              <w:rPr>
+                <w:sz w:val="19"/>
+              </w:rPr>
+            </w:r>
+            <w:r>
+              <w:rPr>
+                <w:sz w:val="19"/>
+              </w:rPr>
+              <w:t>41.18 [29.4, 52.9]</w:t>
+            </w:r>
+          </w:p>
+        </w:tc>
+        <w:tc>
+          <w:tcPr>
+            <w:tcW w:type="dxa" w:w="1152"/>
+          </w:tcPr>
+          <w:p>
+            <w:pPr>
+              <w:spacing w:after="40"/>
+            </w:pPr>
+            <w:r>
+              <w:rPr>
+                <w:sz w:val="19"/>
+              </w:rPr>
+            </w:r>
+            <w:r>
+              <w:rPr>
+                <w:sz w:val="19"/>
+              </w:rPr>
+              <w:t>39.71</w:t>
+            </w:r>
+          </w:p>
+        </w:tc>
+        <w:tc>
+          <w:tcPr>
+            <w:tcW w:type="dxa" w:w="1008"/>
+          </w:tcPr>
+          <w:p>
+            <w:pPr>
+              <w:spacing w:after="40"/>
+            </w:pPr>
+            <w:r>
+              <w:rPr>
+                <w:sz w:val="19"/>
+              </w:rPr>
+            </w:r>
+            <w:r>
+              <w:rPr>
+                <w:sz w:val="19"/>
+              </w:rPr>
+              <w:t>9.88</w:t>
+            </w:r>
+          </w:p>
+        </w:tc>
+        <w:tc>
+          <w:tcPr>
+            <w:tcW w:type="dxa" w:w="1008"/>
+          </w:tcPr>
+          <w:p>
+            <w:pPr>
+              <w:spacing w:after="40"/>
+            </w:pPr>
+            <w:r>
+              <w:rPr>
+                <w:sz w:val="19"/>
+              </w:rPr>
+            </w:r>
+            <w:r>
+              <w:rPr>
+                <w:sz w:val="19"/>
+              </w:rPr>
+              <w:t>0.2787</w:t>
+            </w:r>
+          </w:p>
+        </w:tc>
+        <w:tc>
+          <w:tcPr>
+            <w:tcW w:type="dxa" w:w="1152"/>
+          </w:tcPr>
+          <w:p>
+            <w:pPr>
+              <w:spacing w:after="40"/>
+            </w:pPr>
+            <w:r>
+              <w:rPr>
+                <w:sz w:val="19"/>
+              </w:rPr>
+            </w:r>
+            <w:r>
+              <w:rPr>
+                <w:sz w:val="19"/>
+              </w:rPr>
+              <w:t>4,068.40</w:t>
+            </w:r>
+          </w:p>
+        </w:tc>
+      </w:tr>
+      <w:tr>
+        <w:tc>
+          <w:tcPr>
+            <w:tcW w:type="dxa" w:w="2880"/>
+          </w:tcPr>
+          <w:p>
+            <w:pPr>
+              <w:spacing w:after="40"/>
+            </w:pPr>
+            <w:r>
+              <w:rPr>
+                <w:sz w:val="19"/>
+              </w:rPr>
+            </w:r>
+            <w:r>
+              <w:rPr>
+                <w:sz w:val="19"/>
+              </w:rPr>
+              <w:t>Multi-agent, full (with debate)</w:t>
+            </w:r>
+          </w:p>
+        </w:tc>
+        <w:tc>
+          <w:tcPr>
+            <w:tcW w:type="dxa" w:w="576"/>
+          </w:tcPr>
+          <w:p>
+            <w:pPr>
+              <w:spacing w:after="40"/>
+            </w:pPr>
+            <w:r>
+              <w:rPr>
+                <w:sz w:val="19"/>
+              </w:rPr>
+            </w:r>
+            <w:r>
+              <w:rPr>
+                <w:sz w:val="19"/>
+              </w:rPr>
+              <w:t>68</w:t>
+            </w:r>
+          </w:p>
+        </w:tc>
+        <w:tc>
+          <w:tcPr>
+            <w:tcW w:type="dxa" w:w="2016"/>
+          </w:tcPr>
+          <w:p>
+            <w:pPr>
+              <w:spacing w:after="40"/>
+            </w:pPr>
+            <w:r>
+              <w:rPr>
+                <w:sz w:val="19"/>
+              </w:rPr>
+            </w:r>
+            <w:r>
+              <w:rPr>
+                <w:sz w:val="19"/>
+              </w:rPr>
+              <w:t>50.00 [39.7, 60.3]</w:t>
+            </w:r>
+          </w:p>
+        </w:tc>
+        <w:tc>
+          <w:tcPr>
+            <w:tcW w:type="dxa" w:w="1152"/>
+          </w:tcPr>
+          <w:p>
+            <w:pPr>
+              <w:spacing w:after="40"/>
+            </w:pPr>
+            <w:r>
+              <w:rPr>
+                <w:sz w:val="19"/>
+              </w:rPr>
+            </w:r>
+            <w:r>
+              <w:rPr>
+                <w:sz w:val="19"/>
+              </w:rPr>
+              <w:t>48.53</w:t>
+            </w:r>
+          </w:p>
+        </w:tc>
+        <w:tc>
+          <w:tcPr>
+            <w:tcW w:type="dxa" w:w="1008"/>
+          </w:tcPr>
+          <w:p>
+            <w:pPr>
+              <w:spacing w:after="40"/>
+            </w:pPr>
+            <w:r>
+              <w:rPr>
+                <w:sz w:val="19"/>
+              </w:rPr>
+            </w:r>
+            <w:r>
+              <w:rPr>
+                <w:sz w:val="19"/>
+              </w:rPr>
+              <w:t>10.08</w:t>
+            </w:r>
+          </w:p>
+        </w:tc>
+        <w:tc>
+          <w:tcPr>
+            <w:tcW w:type="dxa" w:w="1008"/>
+          </w:tcPr>
+          <w:p>
+            <w:pPr>
+              <w:spacing w:after="40"/>
+            </w:pPr>
+            <w:r>
+              <w:rPr>
+                <w:sz w:val="19"/>
+              </w:rPr>
+            </w:r>
+            <w:r>
+              <w:rPr>
+                <w:sz w:val="19"/>
+              </w:rPr>
+              <w:t>0.2593</w:t>
+            </w:r>
+          </w:p>
+        </w:tc>
+        <w:tc>
+          <w:tcPr>
+            <w:tcW w:type="dxa" w:w="1152"/>
+          </w:tcPr>
+          <w:p>
+            <w:pPr>
+              <w:spacing w:after="40"/>
+            </w:pPr>
+            <w:r>
+              <w:rPr>
+                <w:sz w:val="19"/>
+              </w:rPr>
+            </w:r>
+            <w:r>
+              <w:rPr>
+                <w:sz w:val="19"/>
+              </w:rPr>
+              <w:t>19,696.18</w:t>
+            </w:r>
+          </w:p>
+        </w:tc>
+      </w:tr>
+      <w:tr>
+        <w:tc>
+          <w:tcPr>
+            <w:tcW w:type="dxa" w:w="2880"/>
+          </w:tcPr>
+          <w:p>
+            <w:pPr>
+              <w:spacing w:after="40"/>
+            </w:pPr>
+            <w:r>
+              <w:rPr>
+                <w:sz w:val="19"/>
+              </w:rPr>
+            </w:r>
+            <w:r>
+              <w:rPr>
+                <w:sz w:val="19"/>
+              </w:rPr>
+              <w:t>Multi-agent, no debate</w:t>
+            </w:r>
+          </w:p>
+        </w:tc>
+        <w:tc>
+          <w:tcPr>
+            <w:tcW w:type="dxa" w:w="576"/>
+          </w:tcPr>
+          <w:p>
+            <w:pPr>
+              <w:spacing w:after="40"/>
+            </w:pPr>
+            <w:r>
+              <w:rPr>
+                <w:sz w:val="19"/>
+              </w:rPr>
+            </w:r>
+            <w:r>
+              <w:rPr>
+                <w:sz w:val="19"/>
+              </w:rPr>
+              <w:t>68</w:t>
+            </w:r>
+          </w:p>
+        </w:tc>
+        <w:tc>
+          <w:tcPr>
+            <w:tcW w:type="dxa" w:w="2016"/>
+          </w:tcPr>
+          <w:p>
+            <w:pPr>
+              <w:spacing w:after="40"/>
+            </w:pPr>
+            <w:r>
+              <w:rPr>
+                <w:sz w:val="19"/>
+              </w:rPr>
+            </w:r>
+            <w:r>
+              <w:rPr>
+                <w:sz w:val="19"/>
+              </w:rPr>
+              <w:t>45.59 [35.3, 54.4]</w:t>
+            </w:r>
+          </w:p>
+        </w:tc>
+        <w:tc>
+          <w:tcPr>
+            <w:tcW w:type="dxa" w:w="1152"/>
+          </w:tcPr>
+          <w:p>
+            <w:pPr>
+              <w:spacing w:after="40"/>
+            </w:pPr>
+            <w:r>
+              <w:rPr>
+                <w:sz w:val="19"/>
+              </w:rPr>
+            </w:r>
+            <w:r>
+              <w:rPr>
+                <w:sz w:val="19"/>
+              </w:rPr>
+              <w:t>41.18</w:t>
+            </w:r>
+          </w:p>
+        </w:tc>
+        <w:tc>
+          <w:tcPr>
+            <w:tcW w:type="dxa" w:w="1008"/>
+          </w:tcPr>
+          <w:p>
+            <w:pPr>
+              <w:spacing w:after="40"/>
+            </w:pPr>
+            <w:r>
+              <w:rPr>
+                <w:sz w:val="19"/>
+              </w:rPr>
+            </w:r>
+            <w:r>
+              <w:rPr>
+                <w:sz w:val="19"/>
+              </w:rPr>
+              <w:t>10.38</w:t>
+            </w:r>
+          </w:p>
+        </w:tc>
+        <w:tc>
+          <w:tcPr>
+            <w:tcW w:type="dxa" w:w="1008"/>
+          </w:tcPr>
+          <w:p>
+            <w:pPr>
+              <w:spacing w:after="40"/>
+            </w:pPr>
+            <w:r>
+              <w:rPr>
+                <w:sz w:val="19"/>
+              </w:rPr>
+            </w:r>
+            <w:r>
+              <w:rPr>
+                <w:sz w:val="19"/>
+              </w:rPr>
+              <w:t>0.2880</w:t>
+            </w:r>
+          </w:p>
+        </w:tc>
+        <w:tc>
+          <w:tcPr>
+            <w:tcW w:type="dxa" w:w="1152"/>
+          </w:tcPr>
+          <w:p>
+            <w:pPr>
+              <w:spacing w:after="40"/>
+            </w:pPr>
+            <w:r>
+              <w:rPr>
+                <w:sz w:val="19"/>
+              </w:rPr>
+            </w:r>
+            <w:r>
+              <w:rPr>
+                <w:sz w:val="19"/>
+              </w:rPr>
+              <w:t>9,185.65</w:t>
             </w:r>
           </w:p>
         </w:tc>
@@ -3717,10 +4150,10 @@
         <w:rPr>
           <w:b/>
         </w:rPr>
-        <w:t>7 of 9 configurations have not been run yet</w:t>
+        <w:t>4 of 9 configurations have not been run to completion</w:t>
       </w:r>
       <w:r>
-        <w:t xml:space="preserve"> and are omitted rather than estimated: Single-LLM baseline, Multi-agent, full (with debate), Multi-agent, no debate, Leave-one-out — no technical, Leave-one-out — no fundamental, Leave-one-out — no sentiment, Leave-one-out — no macro. Run </w:t>
+        <w:t xml:space="preserve"> and are omitted rather than estimated: Leave-one-out — no technical, Leave-one-out — no fundamental, Leave-one-out — no sentiment, Leave-one-out — no macro. These specialist leave-one-out configurations were halted due to daily Gemini request quota exhaustion under Google AI Studio Free Tier (recorded in </w:t>
       </w:r>
       <w:r>
         <w:rPr>
@@ -3728,10 +4161,10 @@
           <w:color w:val="2E5C8A"/>
           <w:sz w:val="19"/>
         </w:rPr>
-        <w:t>python -m evaluate ablate --repeats 3</w:t>
+        <w:t>results/runner_progress.json</w:t>
       </w:r>
       <w:r>
-        <w:t xml:space="preserve"> and regenerate.</w:t>
+        <w:t>).</w:t>
       </w:r>
     </w:p>
     <w:p>
@@ -3744,30 +4177,270 @@
           <w:color w:val="1A1A1A"/>
           <w:sz w:val="22"/>
         </w:rPr>
-        <w:t>The index-drift illusion, measured</w:t>
+        <w:t>6.3.1 Descriptive Findings: Market Base Rates, Model Bias, and Reference Floors</w:t>
       </w:r>
     </w:p>
     <w:p>
+      <w:pPr>
+        <w:pStyle w:val="ListBullet"/>
+        <w:spacing w:after="60"/>
+      </w:pPr>
       <w:r>
-        <w:t xml:space="preserve">The unconditionally bullish rule scores </w:t>
+        <w:rPr>
+          <w:b/>
+        </w:rPr>
+        <w:t>Test Set Market Base Rate</w:t>
+      </w:r>
+      <w:r>
+        <w:t xml:space="preserve">: Over the 68 frozen post-cutoff evaluation cases, </w:t>
       </w:r>
       <w:r>
         <w:rPr>
           <w:b/>
         </w:rPr>
-        <w:t>75.00% raw directional accuracy</w:t>
+        <w:t>40 of 68 outcomes (58.82%) were 'down'</w:t>
       </w:r>
       <w:r>
-        <w:t xml:space="preserve"> but only </w:t>
+        <w:t xml:space="preserve"> and 28 of 68 (41.18%) were 'up'. Consequently, an uninformative </w:t>
       </w:r>
       <w:r>
         <w:rPr>
           <w:b/>
         </w:rPr>
-        <w:t>50.00% against NIFTY 50</w:t>
+        <w:t>always-down rule would score 58.82% directional accuracy</w:t>
       </w:r>
       <w:r>
-        <w:t xml:space="preserve"> — close to chance. This is the single most important reason both columns are reported everywhere in this report. A system quoting only the first number would appear to forecast while doing nothing at all.</w:t>
+        <w:t>, outperforming all evaluated machine learning models.</w:t>
+      </w:r>
+    </w:p>
+    <w:p>
+      <w:pPr>
+        <w:pStyle w:val="ListBullet"/>
+        <w:spacing w:after="60"/>
+      </w:pPr>
+      <w:r>
+        <w:rPr>
+          <w:b/>
+        </w:rPr>
+        <w:t>Baseline Bullish Bias</w:t>
+      </w:r>
+      <w:r>
+        <w:t>: The single-LLM baseline (</w:t>
+      </w:r>
+      <w:r>
+        <w:rPr>
+          <w:rFonts w:ascii="Consolas" w:hAnsi="Consolas"/>
+          <w:color w:val="2E5C8A"/>
+          <w:sz w:val="19"/>
+        </w:rPr>
+        <w:t>baseline</w:t>
+      </w:r>
+      <w:r>
+        <w:t xml:space="preserve">) predicted </w:t>
+      </w:r>
+      <w:r>
+        <w:rPr>
+          <w:b/>
+        </w:rPr>
+        <w:t>'up' on 66 of 68 cases (97.06%)</w:t>
+      </w:r>
+      <w:r>
+        <w:t>, predicting 'down' only twice. Its directional accuracy of 41.18% is entirely an artifact of matching the 41.18% 'up' base rate of the market period.</w:t>
+      </w:r>
+    </w:p>
+    <w:p>
+      <w:pPr>
+        <w:pStyle w:val="ListBullet"/>
+        <w:spacing w:after="60"/>
+      </w:pPr>
+      <w:r>
+        <w:rPr>
+          <w:b/>
+        </w:rPr>
+        <w:t>Multi-Agent Moderation</w:t>
+      </w:r>
+      <w:r>
+        <w:t>: In contrast, the multi-agent system (</w:t>
+      </w:r>
+      <w:r>
+        <w:rPr>
+          <w:rFonts w:ascii="Consolas" w:hAnsi="Consolas"/>
+          <w:color w:val="2E5C8A"/>
+          <w:sz w:val="19"/>
+        </w:rPr>
+        <w:t>multiagent</w:t>
+      </w:r>
+      <w:r>
+        <w:t xml:space="preserve">) moderated this extreme bullish bias to </w:t>
+      </w:r>
+      <w:r>
+        <w:rPr>
+          <w:b/>
+        </w:rPr>
+        <w:t>44 'up' calls and 24 'down' calls (64.71% up)</w:t>
+      </w:r>
+      <w:r>
+        <w:t xml:space="preserve">, while </w:t>
+      </w:r>
+      <w:r>
+        <w:rPr>
+          <w:rFonts w:ascii="Consolas" w:hAnsi="Consolas"/>
+          <w:color w:val="2E5C8A"/>
+          <w:sz w:val="19"/>
+        </w:rPr>
+        <w:t>multiagent-nodebate</w:t>
+      </w:r>
+      <w:r>
+        <w:t xml:space="preserve"> produced 55 'up' calls (80.88% up).</w:t>
+      </w:r>
+    </w:p>
+    <w:p>
+      <w:pPr>
+        <w:pStyle w:val="ListBullet"/>
+        <w:spacing w:after="60"/>
+      </w:pPr>
+      <w:r>
+        <w:rPr>
+          <w:b/>
+        </w:rPr>
+        <w:t>Brier No-Skill Reference Floor</w:t>
+      </w:r>
+      <w:r>
+        <w:t xml:space="preserve">: An uncalibrated 50/50 probability forecast yields an expected </w:t>
+      </w:r>
+      <w:r>
+        <w:rPr>
+          <w:b/>
+        </w:rPr>
+        <w:t>Brier score of exactly 0.2500</w:t>
+      </w:r>
+      <w:r>
+        <w:t xml:space="preserve"> ($0.5^2$). The single-LLM baseline achieved a Brier score of </w:t>
+      </w:r>
+      <w:r>
+        <w:rPr>
+          <w:b/>
+        </w:rPr>
+        <w:t>0.2787</w:t>
+      </w:r>
+      <w:r>
+        <w:t xml:space="preserve"> (worse than the 0.25 reference floor; overconfidence gap 18.23 pts). Multi-agent without debate achieved </w:t>
+      </w:r>
+      <w:r>
+        <w:rPr>
+          <w:b/>
+        </w:rPr>
+        <w:t>0.2880</w:t>
+      </w:r>
+      <w:r>
+        <w:t xml:space="preserve"> (overconfidence gap 19.48 pts). Full multi-agent with debate achieved </w:t>
+      </w:r>
+      <w:r>
+        <w:rPr>
+          <w:b/>
+        </w:rPr>
+        <w:t>0.2593</w:t>
+      </w:r>
+      <w:r>
+        <w:t xml:space="preserve"> (overconfidence gap 10.69 pts), bringing probability estimates closest to the reference baseline.</w:t>
+      </w:r>
+    </w:p>
+    <w:p>
+      <w:pPr>
+        <w:spacing w:before="160" w:after="40"/>
+      </w:pPr>
+      <w:r>
+        <w:rPr>
+          <w:b/>
+          <w:color w:val="1A1A1A"/>
+          <w:sz w:val="22"/>
+        </w:rPr>
+        <w:t>6.3.2 Primary Statistical Comparison: Multi-Agent vs Baseline</w:t>
+      </w:r>
+    </w:p>
+    <w:p>
+      <w:r>
+        <w:t>The primary research question compares the full multi-agent system (</w:t>
+      </w:r>
+      <w:r>
+        <w:rPr>
+          <w:rFonts w:ascii="Consolas" w:hAnsi="Consolas"/>
+          <w:color w:val="2E5C8A"/>
+          <w:sz w:val="19"/>
+        </w:rPr>
+        <w:t>multiagent</w:t>
+      </w:r>
+      <w:r>
+        <w:t>) against the single-LLM baseline (</w:t>
+      </w:r>
+      <w:r>
+        <w:rPr>
+          <w:rFonts w:ascii="Consolas" w:hAnsi="Consolas"/>
+          <w:color w:val="2E5C8A"/>
+          <w:sz w:val="19"/>
+        </w:rPr>
+        <w:t>baseline</w:t>
+      </w:r>
+      <w:r>
+        <w:t xml:space="preserve">). Directional accuracy exhibits a point difference of </w:t>
+      </w:r>
+      <w:r>
+        <w:rPr>
+          <w:b/>
+        </w:rPr>
+        <w:t>+8.82 percentage points</w:t>
+      </w:r>
+      <w:r>
+        <w:t xml:space="preserve"> (50.00% vs 41.18%).</w:t>
+      </w:r>
+    </w:p>
+    <w:p>
+      <w:r>
+        <w:rPr>
+          <w:b/>
+        </w:rPr>
+        <w:t>Confirmatory Test (Pre-registered Decision Rule)</w:t>
+      </w:r>
+      <w:r>
+        <w:t xml:space="preserve">: Clustered uncertainty is estimated via date-block bootstrap (2,000 resamples of whole trading sessions), yielding a 95% confidence interval of </w:t>
+      </w:r>
+      <w:r>
+        <w:rPr>
+          <w:b/>
+        </w:rPr>
+        <w:t>[-4.41, +22.06] percentage points</w:t>
+      </w:r>
+      <w:r>
+        <w:t xml:space="preserve">. Because this date-clustered confidence interval spans zero, the pre-registered protocol mandates that this result be reported as </w:t>
+      </w:r>
+      <w:r>
+        <w:rPr>
+          <w:b/>
+        </w:rPr>
+        <w:t>'no supported difference'</w:t>
+      </w:r>
+      <w:r>
+        <w:t xml:space="preserve"> between the multi-agent system and the single-LLM baseline. Under the pre-registered protocol, point differences are never described as improvements.</w:t>
+      </w:r>
+    </w:p>
+    <w:p>
+      <w:r>
+        <w:rPr>
+          <w:b/>
+        </w:rPr>
+        <w:t>Secondary Paired Test</w:t>
+      </w:r>
+      <w:r>
+        <w:t xml:space="preserve">: Exact two-sided McNemar test yields </w:t>
+      </w:r>
+      <w:r>
+        <w:rPr>
+          <w:b/>
+        </w:rPr>
+        <w:t>p = 0.2863</w:t>
+      </w:r>
+      <w:r>
+        <w:t xml:space="preserve"> (discordant pairs: 14 multiagent-only correct, 8 baseline-only correct). This test is labelled optimistic because it assumes cross-ticker independence within sessions.</w:t>
       </w:r>
     </w:p>
     <w:p>
@@ -3783,47 +4456,586 @@
         <w:t>6.4 Does the debate earn its cost?</w:t>
       </w:r>
     </w:p>
+    <w:tbl>
+      <w:tblPr>
+        <w:tblStyle w:val="TableGrid"/>
+        <w:tblW w:type="auto" w:w="0"/>
+        <w:jc w:val="center"/>
+        <w:tblLook w:firstColumn="1" w:firstRow="1" w:lastColumn="0" w:lastRow="0" w:noHBand="0" w:noVBand="1" w:val="04A0"/>
+      </w:tblPr>
+      <w:tblGrid>
+        <w:gridCol w:w="2448"/>
+        <w:gridCol w:w="2448"/>
+        <w:gridCol w:w="2448"/>
+        <w:gridCol w:w="2448"/>
+      </w:tblGrid>
+      <w:tr>
+        <w:tc>
+          <w:tcPr>
+            <w:tcW w:type="dxa" w:w="3168"/>
+            <w:shd w:val="clear" w:fill="1F3864"/>
+          </w:tcPr>
+          <w:p>
+            <w:pPr>
+              <w:shd w:val="clear" w:fill="1F3864"/>
+            </w:pPr>
+            <w:r/>
+            <w:r>
+              <w:rPr>
+                <w:b/>
+                <w:color w:val="FFFFFF"/>
+                <w:sz w:val="19"/>
+              </w:rPr>
+              <w:t>Measure</w:t>
+            </w:r>
+          </w:p>
+        </w:tc>
+        <w:tc>
+          <w:tcPr>
+            <w:tcW w:type="dxa" w:w="2304"/>
+            <w:shd w:val="clear" w:fill="1F3864"/>
+          </w:tcPr>
+          <w:p>
+            <w:pPr>
+              <w:shd w:val="clear" w:fill="1F3864"/>
+            </w:pPr>
+            <w:r/>
+            <w:r>
+              <w:rPr>
+                <w:b/>
+                <w:color w:val="FFFFFF"/>
+                <w:sz w:val="19"/>
+              </w:rPr>
+              <w:t>With debate</w:t>
+            </w:r>
+          </w:p>
+        </w:tc>
+        <w:tc>
+          <w:tcPr>
+            <w:tcW w:type="dxa" w:w="2304"/>
+            <w:shd w:val="clear" w:fill="1F3864"/>
+          </w:tcPr>
+          <w:p>
+            <w:pPr>
+              <w:shd w:val="clear" w:fill="1F3864"/>
+            </w:pPr>
+            <w:r/>
+            <w:r>
+              <w:rPr>
+                <w:b/>
+                <w:color w:val="FFFFFF"/>
+                <w:sz w:val="19"/>
+              </w:rPr>
+              <w:t>Without debate</w:t>
+            </w:r>
+          </w:p>
+        </w:tc>
+        <w:tc>
+          <w:tcPr>
+            <w:tcW w:type="dxa" w:w="2160"/>
+            <w:shd w:val="clear" w:fill="1F3864"/>
+          </w:tcPr>
+          <w:p>
+            <w:pPr>
+              <w:shd w:val="clear" w:fill="1F3864"/>
+            </w:pPr>
+            <w:r/>
+            <w:r>
+              <w:rPr>
+                <w:b/>
+                <w:color w:val="FFFFFF"/>
+                <w:sz w:val="19"/>
+              </w:rPr>
+              <w:t>Delta</w:t>
+            </w:r>
+          </w:p>
+        </w:tc>
+      </w:tr>
+      <w:tr>
+        <w:tc>
+          <w:tcPr>
+            <w:tcW w:type="dxa" w:w="3168"/>
+          </w:tcPr>
+          <w:p>
+            <w:pPr>
+              <w:spacing w:after="40"/>
+            </w:pPr>
+            <w:r>
+              <w:rPr>
+                <w:sz w:val="19"/>
+              </w:rPr>
+            </w:r>
+            <w:r>
+              <w:rPr>
+                <w:sz w:val="19"/>
+              </w:rPr>
+              <w:t>Directional accuracy %</w:t>
+            </w:r>
+          </w:p>
+        </w:tc>
+        <w:tc>
+          <w:tcPr>
+            <w:tcW w:type="dxa" w:w="2304"/>
+          </w:tcPr>
+          <w:p>
+            <w:pPr>
+              <w:spacing w:after="40"/>
+            </w:pPr>
+            <w:r>
+              <w:rPr>
+                <w:sz w:val="19"/>
+              </w:rPr>
+            </w:r>
+            <w:r>
+              <w:rPr>
+                <w:sz w:val="19"/>
+              </w:rPr>
+              <w:t>50.00</w:t>
+            </w:r>
+          </w:p>
+        </w:tc>
+        <w:tc>
+          <w:tcPr>
+            <w:tcW w:type="dxa" w:w="2304"/>
+          </w:tcPr>
+          <w:p>
+            <w:pPr>
+              <w:spacing w:after="40"/>
+            </w:pPr>
+            <w:r>
+              <w:rPr>
+                <w:sz w:val="19"/>
+              </w:rPr>
+            </w:r>
+            <w:r>
+              <w:rPr>
+                <w:sz w:val="19"/>
+              </w:rPr>
+              <w:t>45.59</w:t>
+            </w:r>
+          </w:p>
+        </w:tc>
+        <w:tc>
+          <w:tcPr>
+            <w:tcW w:type="dxa" w:w="2160"/>
+          </w:tcPr>
+          <w:p>
+            <w:pPr>
+              <w:spacing w:after="40"/>
+            </w:pPr>
+            <w:r>
+              <w:rPr>
+                <w:sz w:val="19"/>
+              </w:rPr>
+            </w:r>
+            <w:r>
+              <w:rPr>
+                <w:sz w:val="19"/>
+              </w:rPr>
+              <w:t>+4.41</w:t>
+            </w:r>
+          </w:p>
+        </w:tc>
+      </w:tr>
+      <w:tr>
+        <w:tc>
+          <w:tcPr>
+            <w:tcW w:type="dxa" w:w="3168"/>
+          </w:tcPr>
+          <w:p>
+            <w:pPr>
+              <w:spacing w:after="40"/>
+            </w:pPr>
+            <w:r>
+              <w:rPr>
+                <w:sz w:val="19"/>
+              </w:rPr>
+            </w:r>
+            <w:r>
+              <w:rPr>
+                <w:sz w:val="19"/>
+              </w:rPr>
+              <w:t>NIFTY-relative accuracy %</w:t>
+            </w:r>
+          </w:p>
+        </w:tc>
+        <w:tc>
+          <w:tcPr>
+            <w:tcW w:type="dxa" w:w="2304"/>
+          </w:tcPr>
+          <w:p>
+            <w:pPr>
+              <w:spacing w:after="40"/>
+            </w:pPr>
+            <w:r>
+              <w:rPr>
+                <w:sz w:val="19"/>
+              </w:rPr>
+            </w:r>
+            <w:r>
+              <w:rPr>
+                <w:sz w:val="19"/>
+              </w:rPr>
+              <w:t>48.53</w:t>
+            </w:r>
+          </w:p>
+        </w:tc>
+        <w:tc>
+          <w:tcPr>
+            <w:tcW w:type="dxa" w:w="2304"/>
+          </w:tcPr>
+          <w:p>
+            <w:pPr>
+              <w:spacing w:after="40"/>
+            </w:pPr>
+            <w:r>
+              <w:rPr>
+                <w:sz w:val="19"/>
+              </w:rPr>
+            </w:r>
+            <w:r>
+              <w:rPr>
+                <w:sz w:val="19"/>
+              </w:rPr>
+              <w:t>41.18</w:t>
+            </w:r>
+          </w:p>
+        </w:tc>
+        <w:tc>
+          <w:tcPr>
+            <w:tcW w:type="dxa" w:w="2160"/>
+          </w:tcPr>
+          <w:p>
+            <w:pPr>
+              <w:spacing w:after="40"/>
+            </w:pPr>
+            <w:r>
+              <w:rPr>
+                <w:sz w:val="19"/>
+              </w:rPr>
+            </w:r>
+            <w:r>
+              <w:rPr>
+                <w:sz w:val="19"/>
+              </w:rPr>
+              <w:t>+7.35</w:t>
+            </w:r>
+          </w:p>
+        </w:tc>
+      </w:tr>
+      <w:tr>
+        <w:tc>
+          <w:tcPr>
+            <w:tcW w:type="dxa" w:w="3168"/>
+          </w:tcPr>
+          <w:p>
+            <w:pPr>
+              <w:spacing w:after="40"/>
+            </w:pPr>
+            <w:r>
+              <w:rPr>
+                <w:sz w:val="19"/>
+              </w:rPr>
+            </w:r>
+            <w:r>
+              <w:rPr>
+                <w:sz w:val="19"/>
+              </w:rPr>
+              <w:t>Brier score (lower better)</w:t>
+            </w:r>
+          </w:p>
+        </w:tc>
+        <w:tc>
+          <w:tcPr>
+            <w:tcW w:type="dxa" w:w="2304"/>
+          </w:tcPr>
+          <w:p>
+            <w:pPr>
+              <w:spacing w:after="40"/>
+            </w:pPr>
+            <w:r>
+              <w:rPr>
+                <w:sz w:val="19"/>
+              </w:rPr>
+            </w:r>
+            <w:r>
+              <w:rPr>
+                <w:sz w:val="19"/>
+              </w:rPr>
+              <w:t>0.2593</w:t>
+            </w:r>
+          </w:p>
+        </w:tc>
+        <w:tc>
+          <w:tcPr>
+            <w:tcW w:type="dxa" w:w="2304"/>
+          </w:tcPr>
+          <w:p>
+            <w:pPr>
+              <w:spacing w:after="40"/>
+            </w:pPr>
+            <w:r>
+              <w:rPr>
+                <w:sz w:val="19"/>
+              </w:rPr>
+            </w:r>
+            <w:r>
+              <w:rPr>
+                <w:sz w:val="19"/>
+              </w:rPr>
+              <w:t>0.2880</w:t>
+            </w:r>
+          </w:p>
+        </w:tc>
+        <w:tc>
+          <w:tcPr>
+            <w:tcW w:type="dxa" w:w="2160"/>
+          </w:tcPr>
+          <w:p>
+            <w:pPr>
+              <w:spacing w:after="40"/>
+            </w:pPr>
+            <w:r>
+              <w:rPr>
+                <w:sz w:val="19"/>
+              </w:rPr>
+            </w:r>
+            <w:r>
+              <w:rPr>
+                <w:sz w:val="19"/>
+              </w:rPr>
+              <w:t>-0.0287</w:t>
+            </w:r>
+          </w:p>
+        </w:tc>
+      </w:tr>
+      <w:tr>
+        <w:tc>
+          <w:tcPr>
+            <w:tcW w:type="dxa" w:w="3168"/>
+          </w:tcPr>
+          <w:p>
+            <w:pPr>
+              <w:spacing w:after="40"/>
+            </w:pPr>
+            <w:r>
+              <w:rPr>
+                <w:sz w:val="19"/>
+              </w:rPr>
+            </w:r>
+            <w:r>
+              <w:rPr>
+                <w:sz w:val="19"/>
+              </w:rPr>
+              <w:t>Tokens per forecast</w:t>
+            </w:r>
+          </w:p>
+        </w:tc>
+        <w:tc>
+          <w:tcPr>
+            <w:tcW w:type="dxa" w:w="2304"/>
+          </w:tcPr>
+          <w:p>
+            <w:pPr>
+              <w:spacing w:after="40"/>
+            </w:pPr>
+            <w:r>
+              <w:rPr>
+                <w:sz w:val="19"/>
+              </w:rPr>
+            </w:r>
+            <w:r>
+              <w:rPr>
+                <w:sz w:val="19"/>
+              </w:rPr>
+              <w:t>19,696.18</w:t>
+            </w:r>
+          </w:p>
+        </w:tc>
+        <w:tc>
+          <w:tcPr>
+            <w:tcW w:type="dxa" w:w="2304"/>
+          </w:tcPr>
+          <w:p>
+            <w:pPr>
+              <w:spacing w:after="40"/>
+            </w:pPr>
+            <w:r>
+              <w:rPr>
+                <w:sz w:val="19"/>
+              </w:rPr>
+            </w:r>
+            <w:r>
+              <w:rPr>
+                <w:sz w:val="19"/>
+              </w:rPr>
+              <w:t>9,185.65</w:t>
+            </w:r>
+          </w:p>
+        </w:tc>
+        <w:tc>
+          <w:tcPr>
+            <w:tcW w:type="dxa" w:w="2160"/>
+          </w:tcPr>
+          <w:p>
+            <w:pPr>
+              <w:spacing w:after="40"/>
+            </w:pPr>
+            <w:r>
+              <w:rPr>
+                <w:sz w:val="19"/>
+              </w:rPr>
+            </w:r>
+            <w:r>
+              <w:rPr>
+                <w:sz w:val="19"/>
+              </w:rPr>
+              <w:t>2.14x</w:t>
+            </w:r>
+          </w:p>
+        </w:tc>
+      </w:tr>
+      <w:tr>
+        <w:tc>
+          <w:tcPr>
+            <w:tcW w:type="dxa" w:w="3168"/>
+          </w:tcPr>
+          <w:p>
+            <w:pPr>
+              <w:spacing w:after="40"/>
+            </w:pPr>
+            <w:r>
+              <w:rPr>
+                <w:sz w:val="19"/>
+              </w:rPr>
+            </w:r>
+            <w:r>
+              <w:rPr>
+                <w:sz w:val="19"/>
+              </w:rPr>
+              <w:t>Seconds per forecast</w:t>
+            </w:r>
+          </w:p>
+        </w:tc>
+        <w:tc>
+          <w:tcPr>
+            <w:tcW w:type="dxa" w:w="2304"/>
+          </w:tcPr>
+          <w:p>
+            <w:pPr>
+              <w:spacing w:after="40"/>
+            </w:pPr>
+            <w:r>
+              <w:rPr>
+                <w:sz w:val="19"/>
+              </w:rPr>
+            </w:r>
+            <w:r>
+              <w:rPr>
+                <w:sz w:val="19"/>
+              </w:rPr>
+              <w:t>53.63</w:t>
+            </w:r>
+          </w:p>
+        </w:tc>
+        <w:tc>
+          <w:tcPr>
+            <w:tcW w:type="dxa" w:w="2304"/>
+          </w:tcPr>
+          <w:p>
+            <w:pPr>
+              <w:spacing w:after="40"/>
+            </w:pPr>
+            <w:r>
+              <w:rPr>
+                <w:sz w:val="19"/>
+              </w:rPr>
+            </w:r>
+            <w:r>
+              <w:rPr>
+                <w:sz w:val="19"/>
+              </w:rPr>
+              <w:t>7.46</w:t>
+            </w:r>
+          </w:p>
+        </w:tc>
+        <w:tc>
+          <w:tcPr>
+            <w:tcW w:type="dxa" w:w="2160"/>
+          </w:tcPr>
+          <w:p>
+            <w:pPr>
+              <w:spacing w:after="40"/>
+            </w:pPr>
+            <w:r>
+              <w:rPr>
+                <w:sz w:val="19"/>
+              </w:rPr>
+            </w:r>
+            <w:r>
+              <w:rPr>
+                <w:sz w:val="19"/>
+              </w:rPr>
+              <w:t>7.19x</w:t>
+            </w:r>
+          </w:p>
+        </w:tc>
+      </w:tr>
+    </w:tbl>
+    <w:p/>
     <w:p>
-      <w:pPr>
-        <w:spacing w:before="120" w:after="160"/>
-        <w:ind w:left="216"/>
-        <w:shd w:val="clear" w:fill="E8F0FA"/>
-      </w:pPr>
+      <w:r>
+        <w:t xml:space="preserve">The debate stage costs </w:t>
+      </w:r>
       <w:r>
         <w:rPr>
           <w:b/>
         </w:rPr>
-        <w:t>PENDING — the debate ablation requires both multiagent runs.</w:t>
+        <w:t>2.14x the tokens</w:t>
       </w:r>
       <w:r>
-        <w:t xml:space="preserve"> This table is generated from the committed files in </w:t>
+        <w:t xml:space="preserve"> (19,696 vs 9,186 tokens/fc) and </w:t>
       </w:r>
       <w:r>
         <w:rPr>
-          <w:rFonts w:ascii="Consolas" w:hAnsi="Consolas"/>
-          <w:color w:val="2E5C8A"/>
-          <w:sz w:val="19"/>
+          <w:b/>
         </w:rPr>
-        <w:t>results/</w:t>
+        <w:t>7.19x the wall time</w:t>
       </w:r>
       <w:r>
-        <w:t xml:space="preserve">. The run has not been executed yet, so no numbers are shown rather than placeholder numbers. Re-run </w:t>
+        <w:t xml:space="preserve"> (53.63s vs 7.46s) of the same specialists without it. Directional accuracy exhibits a point difference of </w:t>
       </w:r>
       <w:r>
         <w:rPr>
-          <w:rFonts w:ascii="Consolas" w:hAnsi="Consolas"/>
-          <w:color w:val="2E5C8A"/>
-          <w:sz w:val="19"/>
+          <w:b/>
         </w:rPr>
-        <w:t>python -m scripts.make_thesis</w:t>
+        <w:t>+4.41 percentage points</w:t>
       </w:r>
       <w:r>
-        <w:t xml:space="preserve"> after the experiment and this section fills itself.</w:t>
+        <w:t xml:space="preserve"> (50.00% vs 45.59%).</w:t>
       </w:r>
     </w:p>
     <w:p>
       <w:r>
-        <w:t>The measurement is a single switch: the debate is one conditional edge in the agent graph, so the two configurations differ by exactly four LLM calls and one evidence block. Verified against a stubbed model: the full system makes nine calls, the no-debate configuration makes five.</w:t>
+        <w:t xml:space="preserve">Under the pre-registered decision rule, the 95% date-block bootstrap confidence interval for this difference is </w:t>
+      </w:r>
+      <w:r>
+        <w:rPr>
+          <w:b/>
+        </w:rPr>
+        <w:t>[-2.94, +13.24] percentage points</w:t>
+      </w:r>
+      <w:r>
+        <w:t xml:space="preserve">. Because this interval includes zero (McNemar exact p = 0.5488), the data support </w:t>
+      </w:r>
+      <w:r>
+        <w:rPr>
+          <w:b/>
+        </w:rPr>
+        <w:t>no supported difference</w:t>
+      </w:r>
+      <w:r>
+        <w:t xml:space="preserve"> in directional accuracy attributable to the debate stage.</w:t>
       </w:r>
     </w:p>
     <w:p>
@@ -3849,10 +5061,10 @@
         <w:rPr>
           <w:b/>
         </w:rPr>
-        <w:t>PENDING — the leave-one-out sweep has not been run.</w:t>
+        <w:t>Status: Halted Due to API Quota.</w:t>
       </w:r>
       <w:r>
-        <w:t xml:space="preserve"> This table is generated from the committed files in </w:t>
+        <w:t xml:space="preserve"> Specialist leave-one-out ablations (</w:t>
       </w:r>
       <w:r>
         <w:rPr>
@@ -3860,10 +5072,10 @@
           <w:color w:val="2E5C8A"/>
           <w:sz w:val="19"/>
         </w:rPr>
-        <w:t>results/</w:t>
+        <w:t>multiagent-no-technical</w:t>
       </w:r>
       <w:r>
-        <w:t xml:space="preserve">. The run has not been executed yet, so no numbers are shown rather than placeholder numbers. Re-run </w:t>
+        <w:t xml:space="preserve">, </w:t>
       </w:r>
       <w:r>
         <w:rPr>
@@ -3871,10 +5083,43 @@
           <w:color w:val="2E5C8A"/>
           <w:sz w:val="19"/>
         </w:rPr>
-        <w:t>python -m scripts.make_thesis</w:t>
+        <w:t>multiagent-no-fundamental</w:t>
       </w:r>
       <w:r>
-        <w:t xml:space="preserve"> after the experiment and this section fills itself.</w:t>
+        <w:t xml:space="preserve">, </w:t>
+      </w:r>
+      <w:r>
+        <w:rPr>
+          <w:rFonts w:ascii="Consolas" w:hAnsi="Consolas"/>
+          <w:color w:val="2E5C8A"/>
+          <w:sz w:val="19"/>
+        </w:rPr>
+        <w:t>multiagent-no-sentiment</w:t>
+      </w:r>
+      <w:r>
+        <w:t xml:space="preserve">, </w:t>
+      </w:r>
+      <w:r>
+        <w:rPr>
+          <w:rFonts w:ascii="Consolas" w:hAnsi="Consolas"/>
+          <w:color w:val="2E5C8A"/>
+          <w:sz w:val="19"/>
+        </w:rPr>
+        <w:t>multiagent-no-macro</w:t>
+      </w:r>
+      <w:r>
+        <w:t xml:space="preserve">) were scheduled in Round 1 but could not be completed under Google AI Studio Free Tier due to daily request quota exhaustion (recorded in </w:t>
+      </w:r>
+      <w:r>
+        <w:rPr>
+          <w:rFonts w:ascii="Consolas" w:hAnsi="Consolas"/>
+          <w:color w:val="2E5C8A"/>
+          <w:sz w:val="19"/>
+        </w:rPr>
+        <w:t>results/runner_progress.json</w:t>
+      </w:r>
+      <w:r>
+        <w:t>). They are omitted rather than simulated with unverified synthetic figures.</w:t>
       </w:r>
     </w:p>
     <w:p>
@@ -3887,63 +5132,788 @@
           <w:color w:val="2E5C8A"/>
           <w:sz w:val="25"/>
         </w:rPr>
-        <w:t>6.6 Calibration</w:t>
+        <w:t>6.6 Computational Cost and Latency Accounting</w:t>
       </w:r>
     </w:p>
-    <w:p>
-      <w:r>
-        <w:t xml:space="preserve">Calibration is scored with a Brier score and a reliability table binned by stated confidence. This is the most plausible place for a multi-agent system with an explicit risk officer to beat a single call: not by being right more often, but by knowing when it is unsure. The reliability table for each configuration is written to </w:t>
-      </w:r>
-      <w:r>
-        <w:rPr>
-          <w:rFonts w:ascii="Consolas" w:hAnsi="Consolas"/>
-          <w:color w:val="2E5C8A"/>
-          <w:sz w:val="19"/>
-        </w:rPr>
-        <w:t>results/</w:t>
-      </w:r>
-      <w:r>
-        <w:t xml:space="preserve"> alongside its CSV.</w:t>
-      </w:r>
-    </w:p>
-    <w:p>
-      <w:pPr>
-        <w:spacing w:before="120" w:after="160"/>
-        <w:ind w:left="216"/>
-        <w:shd w:val="clear" w:fill="E8F0FA"/>
-      </w:pPr>
-      <w:r>
-        <w:rPr>
-          <w:b/>
-        </w:rPr>
-        <w:t>PENDING — calibration curves require scored LLM runs.</w:t>
-      </w:r>
-      <w:r>
-        <w:t xml:space="preserve"> This table is generated from the committed files in </w:t>
-      </w:r>
-      <w:r>
-        <w:rPr>
-          <w:rFonts w:ascii="Consolas" w:hAnsi="Consolas"/>
-          <w:color w:val="2E5C8A"/>
-          <w:sz w:val="19"/>
-        </w:rPr>
-        <w:t>results/</w:t>
-      </w:r>
-      <w:r>
-        <w:t xml:space="preserve">. The run has not been executed yet, so no numbers are shown rather than placeholder numbers. Re-run </w:t>
-      </w:r>
-      <w:r>
-        <w:rPr>
-          <w:rFonts w:ascii="Consolas" w:hAnsi="Consolas"/>
-          <w:color w:val="2E5C8A"/>
-          <w:sz w:val="19"/>
-        </w:rPr>
-        <w:t>python -m scripts.make_thesis</w:t>
-      </w:r>
-      <w:r>
-        <w:t xml:space="preserve"> after the experiment and this section fills itself.</w:t>
-      </w:r>
-    </w:p>
+    <w:tbl>
+      <w:tblPr>
+        <w:tblStyle w:val="TableGrid"/>
+        <w:tblW w:type="auto" w:w="0"/>
+        <w:jc w:val="center"/>
+        <w:tblLook w:firstColumn="1" w:firstRow="1" w:lastColumn="0" w:lastRow="0" w:noHBand="0" w:noVBand="1" w:val="04A0"/>
+      </w:tblPr>
+      <w:tblGrid>
+        <w:gridCol w:w="1632"/>
+        <w:gridCol w:w="1632"/>
+        <w:gridCol w:w="1632"/>
+        <w:gridCol w:w="1632"/>
+        <w:gridCol w:w="1632"/>
+        <w:gridCol w:w="1632"/>
+      </w:tblGrid>
+      <w:tr>
+        <w:tc>
+          <w:tcPr>
+            <w:tcW w:type="dxa" w:w="3168"/>
+            <w:shd w:val="clear" w:fill="1F3864"/>
+          </w:tcPr>
+          <w:p>
+            <w:pPr>
+              <w:shd w:val="clear" w:fill="1F3864"/>
+            </w:pPr>
+            <w:r/>
+            <w:r>
+              <w:rPr>
+                <w:b/>
+                <w:color w:val="FFFFFF"/>
+                <w:sz w:val="19"/>
+              </w:rPr>
+              <w:t>System</w:t>
+            </w:r>
+          </w:p>
+        </w:tc>
+        <w:tc>
+          <w:tcPr>
+            <w:tcW w:type="dxa" w:w="1728"/>
+            <w:shd w:val="clear" w:fill="1F3864"/>
+          </w:tcPr>
+          <w:p>
+            <w:pPr>
+              <w:shd w:val="clear" w:fill="1F3864"/>
+            </w:pPr>
+            <w:r/>
+            <w:r>
+              <w:rPr>
+                <w:b/>
+                <w:color w:val="FFFFFF"/>
+                <w:sz w:val="19"/>
+              </w:rPr>
+              <w:t>Tokens / Forecast</w:t>
+            </w:r>
+          </w:p>
+        </w:tc>
+        <w:tc>
+          <w:tcPr>
+            <w:tcW w:type="dxa" w:w="1440"/>
+            <w:shd w:val="clear" w:fill="1F3864"/>
+          </w:tcPr>
+          <w:p>
+            <w:pPr>
+              <w:shd w:val="clear" w:fill="1F3864"/>
+            </w:pPr>
+            <w:r/>
+            <w:r>
+              <w:rPr>
+                <w:b/>
+                <w:color w:val="FFFFFF"/>
+                <w:sz w:val="19"/>
+              </w:rPr>
+              <w:t>LLM Calls / Forecast</w:t>
+            </w:r>
+          </w:p>
+        </w:tc>
+        <w:tc>
+          <w:tcPr>
+            <w:tcW w:type="dxa" w:w="1440"/>
+            <w:shd w:val="clear" w:fill="1F3864"/>
+          </w:tcPr>
+          <w:p>
+            <w:pPr>
+              <w:shd w:val="clear" w:fill="1F3864"/>
+            </w:pPr>
+            <w:r/>
+            <w:r>
+              <w:rPr>
+                <w:b/>
+                <w:color w:val="FFFFFF"/>
+                <w:sz w:val="19"/>
+              </w:rPr>
+              <w:t>Sec / Forecast</w:t>
+            </w:r>
+          </w:p>
+        </w:tc>
+        <w:tc>
+          <w:tcPr>
+            <w:tcW w:type="dxa" w:w="1584"/>
+            <w:shd w:val="clear" w:fill="1F3864"/>
+          </w:tcPr>
+          <w:p>
+            <w:pPr>
+              <w:shd w:val="clear" w:fill="1F3864"/>
+            </w:pPr>
+            <w:r/>
+            <w:r>
+              <w:rPr>
+                <w:b/>
+                <w:color w:val="FFFFFF"/>
+                <w:sz w:val="19"/>
+              </w:rPr>
+              <w:t>Tokens vs Baseline</w:t>
+            </w:r>
+          </w:p>
+        </w:tc>
+        <w:tc>
+          <w:tcPr>
+            <w:tcW w:type="dxa" w:w="1584"/>
+            <w:shd w:val="clear" w:fill="1F3864"/>
+          </w:tcPr>
+          <w:p>
+            <w:pPr>
+              <w:shd w:val="clear" w:fill="1F3864"/>
+            </w:pPr>
+            <w:r/>
+            <w:r>
+              <w:rPr>
+                <w:b/>
+                <w:color w:val="FFFFFF"/>
+                <w:sz w:val="19"/>
+              </w:rPr>
+              <w:t>Wall Time vs Baseline</w:t>
+            </w:r>
+          </w:p>
+        </w:tc>
+      </w:tr>
+      <w:tr>
+        <w:tc>
+          <w:tcPr>
+            <w:tcW w:type="dxa" w:w="3168"/>
+          </w:tcPr>
+          <w:p>
+            <w:pPr>
+              <w:spacing w:after="40"/>
+            </w:pPr>
+            <w:r>
+              <w:rPr>
+                <w:sz w:val="19"/>
+              </w:rPr>
+            </w:r>
+            <w:r>
+              <w:rPr>
+                <w:sz w:val="19"/>
+              </w:rPr>
+              <w:t>Naive — momentum persistence</w:t>
+            </w:r>
+          </w:p>
+        </w:tc>
+        <w:tc>
+          <w:tcPr>
+            <w:tcW w:type="dxa" w:w="1728"/>
+          </w:tcPr>
+          <w:p>
+            <w:pPr>
+              <w:spacing w:after="40"/>
+            </w:pPr>
+            <w:r>
+              <w:rPr>
+                <w:sz w:val="19"/>
+              </w:rPr>
+            </w:r>
+            <w:r>
+              <w:rPr>
+                <w:sz w:val="19"/>
+              </w:rPr>
+              <w:t>0.00</w:t>
+            </w:r>
+          </w:p>
+        </w:tc>
+        <w:tc>
+          <w:tcPr>
+            <w:tcW w:type="dxa" w:w="1440"/>
+          </w:tcPr>
+          <w:p>
+            <w:pPr>
+              <w:spacing w:after="40"/>
+            </w:pPr>
+            <w:r>
+              <w:rPr>
+                <w:sz w:val="19"/>
+              </w:rPr>
+            </w:r>
+            <w:r>
+              <w:rPr>
+                <w:sz w:val="19"/>
+              </w:rPr>
+              <w:t>0.0</w:t>
+            </w:r>
+          </w:p>
+        </w:tc>
+        <w:tc>
+          <w:tcPr>
+            <w:tcW w:type="dxa" w:w="1440"/>
+          </w:tcPr>
+          <w:p>
+            <w:pPr>
+              <w:spacing w:after="40"/>
+            </w:pPr>
+            <w:r>
+              <w:rPr>
+                <w:sz w:val="19"/>
+              </w:rPr>
+            </w:r>
+            <w:r>
+              <w:rPr>
+                <w:sz w:val="19"/>
+              </w:rPr>
+              <w:t>0.06s</w:t>
+            </w:r>
+          </w:p>
+        </w:tc>
+        <w:tc>
+          <w:tcPr>
+            <w:tcW w:type="dxa" w:w="1584"/>
+          </w:tcPr>
+          <w:p>
+            <w:pPr>
+              <w:spacing w:after="40"/>
+            </w:pPr>
+            <w:r>
+              <w:rPr>
+                <w:sz w:val="19"/>
+              </w:rPr>
+            </w:r>
+            <w:r>
+              <w:rPr>
+                <w:sz w:val="19"/>
+              </w:rPr>
+              <w:t>0.00x</w:t>
+            </w:r>
+          </w:p>
+        </w:tc>
+        <w:tc>
+          <w:tcPr>
+            <w:tcW w:type="dxa" w:w="1584"/>
+          </w:tcPr>
+          <w:p>
+            <w:pPr>
+              <w:spacing w:after="40"/>
+            </w:pPr>
+            <w:r>
+              <w:rPr>
+                <w:sz w:val="19"/>
+              </w:rPr>
+            </w:r>
+            <w:r>
+              <w:rPr>
+                <w:sz w:val="19"/>
+              </w:rPr>
+              <w:t>0.01x</w:t>
+            </w:r>
+          </w:p>
+        </w:tc>
+      </w:tr>
+      <w:tr>
+        <w:tc>
+          <w:tcPr>
+            <w:tcW w:type="dxa" w:w="3168"/>
+          </w:tcPr>
+          <w:p>
+            <w:pPr>
+              <w:spacing w:after="40"/>
+            </w:pPr>
+            <w:r>
+              <w:rPr>
+                <w:sz w:val="19"/>
+              </w:rPr>
+            </w:r>
+            <w:r>
+              <w:rPr>
+                <w:sz w:val="19"/>
+              </w:rPr>
+              <w:t>Naive — always up (buy &amp; hold proxy)</w:t>
+            </w:r>
+          </w:p>
+        </w:tc>
+        <w:tc>
+          <w:tcPr>
+            <w:tcW w:type="dxa" w:w="1728"/>
+          </w:tcPr>
+          <w:p>
+            <w:pPr>
+              <w:spacing w:after="40"/>
+            </w:pPr>
+            <w:r>
+              <w:rPr>
+                <w:sz w:val="19"/>
+              </w:rPr>
+            </w:r>
+            <w:r>
+              <w:rPr>
+                <w:sz w:val="19"/>
+              </w:rPr>
+              <w:t>0.00</w:t>
+            </w:r>
+          </w:p>
+        </w:tc>
+        <w:tc>
+          <w:tcPr>
+            <w:tcW w:type="dxa" w:w="1440"/>
+          </w:tcPr>
+          <w:p>
+            <w:pPr>
+              <w:spacing w:after="40"/>
+            </w:pPr>
+            <w:r>
+              <w:rPr>
+                <w:sz w:val="19"/>
+              </w:rPr>
+            </w:r>
+            <w:r>
+              <w:rPr>
+                <w:sz w:val="19"/>
+              </w:rPr>
+              <w:t>0.0</w:t>
+            </w:r>
+          </w:p>
+        </w:tc>
+        <w:tc>
+          <w:tcPr>
+            <w:tcW w:type="dxa" w:w="1440"/>
+          </w:tcPr>
+          <w:p>
+            <w:pPr>
+              <w:spacing w:after="40"/>
+            </w:pPr>
+            <w:r>
+              <w:rPr>
+                <w:sz w:val="19"/>
+              </w:rPr>
+            </w:r>
+            <w:r>
+              <w:rPr>
+                <w:sz w:val="19"/>
+              </w:rPr>
+              <w:t>0.04s</w:t>
+            </w:r>
+          </w:p>
+        </w:tc>
+        <w:tc>
+          <w:tcPr>
+            <w:tcW w:type="dxa" w:w="1584"/>
+          </w:tcPr>
+          <w:p>
+            <w:pPr>
+              <w:spacing w:after="40"/>
+            </w:pPr>
+            <w:r>
+              <w:rPr>
+                <w:sz w:val="19"/>
+              </w:rPr>
+            </w:r>
+            <w:r>
+              <w:rPr>
+                <w:sz w:val="19"/>
+              </w:rPr>
+              <w:t>0.00x</w:t>
+            </w:r>
+          </w:p>
+        </w:tc>
+        <w:tc>
+          <w:tcPr>
+            <w:tcW w:type="dxa" w:w="1584"/>
+          </w:tcPr>
+          <w:p>
+            <w:pPr>
+              <w:spacing w:after="40"/>
+            </w:pPr>
+            <w:r>
+              <w:rPr>
+                <w:sz w:val="19"/>
+              </w:rPr>
+            </w:r>
+            <w:r>
+              <w:rPr>
+                <w:sz w:val="19"/>
+              </w:rPr>
+              <w:t>0.01x</w:t>
+            </w:r>
+          </w:p>
+        </w:tc>
+      </w:tr>
+      <w:tr>
+        <w:tc>
+          <w:tcPr>
+            <w:tcW w:type="dxa" w:w="3168"/>
+          </w:tcPr>
+          <w:p>
+            <w:pPr>
+              <w:spacing w:after="40"/>
+            </w:pPr>
+            <w:r>
+              <w:rPr>
+                <w:sz w:val="19"/>
+              </w:rPr>
+            </w:r>
+            <w:r>
+              <w:rPr>
+                <w:sz w:val="19"/>
+              </w:rPr>
+              <w:t>Single-LLM baseline</w:t>
+            </w:r>
+          </w:p>
+        </w:tc>
+        <w:tc>
+          <w:tcPr>
+            <w:tcW w:type="dxa" w:w="1728"/>
+          </w:tcPr>
+          <w:p>
+            <w:pPr>
+              <w:spacing w:after="40"/>
+            </w:pPr>
+            <w:r>
+              <w:rPr>
+                <w:sz w:val="19"/>
+              </w:rPr>
+            </w:r>
+            <w:r>
+              <w:rPr>
+                <w:sz w:val="19"/>
+              </w:rPr>
+              <w:t>4,068.40</w:t>
+            </w:r>
+          </w:p>
+        </w:tc>
+        <w:tc>
+          <w:tcPr>
+            <w:tcW w:type="dxa" w:w="1440"/>
+          </w:tcPr>
+          <w:p>
+            <w:pPr>
+              <w:spacing w:after="40"/>
+            </w:pPr>
+            <w:r>
+              <w:rPr>
+                <w:sz w:val="19"/>
+              </w:rPr>
+            </w:r>
+            <w:r>
+              <w:rPr>
+                <w:sz w:val="19"/>
+              </w:rPr>
+              <w:t>1.0</w:t>
+            </w:r>
+          </w:p>
+        </w:tc>
+        <w:tc>
+          <w:tcPr>
+            <w:tcW w:type="dxa" w:w="1440"/>
+          </w:tcPr>
+          <w:p>
+            <w:pPr>
+              <w:spacing w:after="40"/>
+            </w:pPr>
+            <w:r>
+              <w:rPr>
+                <w:sz w:val="19"/>
+              </w:rPr>
+            </w:r>
+            <w:r>
+              <w:rPr>
+                <w:sz w:val="19"/>
+              </w:rPr>
+              <w:t>6.49s</w:t>
+            </w:r>
+          </w:p>
+        </w:tc>
+        <w:tc>
+          <w:tcPr>
+            <w:tcW w:type="dxa" w:w="1584"/>
+          </w:tcPr>
+          <w:p>
+            <w:pPr>
+              <w:spacing w:after="40"/>
+            </w:pPr>
+            <w:r>
+              <w:rPr>
+                <w:sz w:val="19"/>
+              </w:rPr>
+            </w:r>
+            <w:r>
+              <w:rPr>
+                <w:sz w:val="19"/>
+              </w:rPr>
+              <w:t>1.00x</w:t>
+            </w:r>
+          </w:p>
+        </w:tc>
+        <w:tc>
+          <w:tcPr>
+            <w:tcW w:type="dxa" w:w="1584"/>
+          </w:tcPr>
+          <w:p>
+            <w:pPr>
+              <w:spacing w:after="40"/>
+            </w:pPr>
+            <w:r>
+              <w:rPr>
+                <w:sz w:val="19"/>
+              </w:rPr>
+            </w:r>
+            <w:r>
+              <w:rPr>
+                <w:sz w:val="19"/>
+              </w:rPr>
+              <w:t>1.00x</w:t>
+            </w:r>
+          </w:p>
+        </w:tc>
+      </w:tr>
+      <w:tr>
+        <w:tc>
+          <w:tcPr>
+            <w:tcW w:type="dxa" w:w="3168"/>
+          </w:tcPr>
+          <w:p>
+            <w:pPr>
+              <w:spacing w:after="40"/>
+            </w:pPr>
+            <w:r>
+              <w:rPr>
+                <w:sz w:val="19"/>
+              </w:rPr>
+            </w:r>
+            <w:r>
+              <w:rPr>
+                <w:sz w:val="19"/>
+              </w:rPr>
+              <w:t>Multi-agent, no debate</w:t>
+            </w:r>
+          </w:p>
+        </w:tc>
+        <w:tc>
+          <w:tcPr>
+            <w:tcW w:type="dxa" w:w="1728"/>
+          </w:tcPr>
+          <w:p>
+            <w:pPr>
+              <w:spacing w:after="40"/>
+            </w:pPr>
+            <w:r>
+              <w:rPr>
+                <w:sz w:val="19"/>
+              </w:rPr>
+            </w:r>
+            <w:r>
+              <w:rPr>
+                <w:sz w:val="19"/>
+              </w:rPr>
+              <w:t>9,185.65</w:t>
+            </w:r>
+          </w:p>
+        </w:tc>
+        <w:tc>
+          <w:tcPr>
+            <w:tcW w:type="dxa" w:w="1440"/>
+          </w:tcPr>
+          <w:p>
+            <w:pPr>
+              <w:spacing w:after="40"/>
+            </w:pPr>
+            <w:r>
+              <w:rPr>
+                <w:sz w:val="19"/>
+              </w:rPr>
+            </w:r>
+            <w:r>
+              <w:rPr>
+                <w:sz w:val="19"/>
+              </w:rPr>
+              <w:t>4.9</w:t>
+            </w:r>
+          </w:p>
+        </w:tc>
+        <w:tc>
+          <w:tcPr>
+            <w:tcW w:type="dxa" w:w="1440"/>
+          </w:tcPr>
+          <w:p>
+            <w:pPr>
+              <w:spacing w:after="40"/>
+            </w:pPr>
+            <w:r>
+              <w:rPr>
+                <w:sz w:val="19"/>
+              </w:rPr>
+            </w:r>
+            <w:r>
+              <w:rPr>
+                <w:sz w:val="19"/>
+              </w:rPr>
+              <w:t>7.46s</w:t>
+            </w:r>
+          </w:p>
+        </w:tc>
+        <w:tc>
+          <w:tcPr>
+            <w:tcW w:type="dxa" w:w="1584"/>
+          </w:tcPr>
+          <w:p>
+            <w:pPr>
+              <w:spacing w:after="40"/>
+            </w:pPr>
+            <w:r>
+              <w:rPr>
+                <w:sz w:val="19"/>
+              </w:rPr>
+            </w:r>
+            <w:r>
+              <w:rPr>
+                <w:sz w:val="19"/>
+              </w:rPr>
+              <w:t>2.26x</w:t>
+            </w:r>
+          </w:p>
+        </w:tc>
+        <w:tc>
+          <w:tcPr>
+            <w:tcW w:type="dxa" w:w="1584"/>
+          </w:tcPr>
+          <w:p>
+            <w:pPr>
+              <w:spacing w:after="40"/>
+            </w:pPr>
+            <w:r>
+              <w:rPr>
+                <w:sz w:val="19"/>
+              </w:rPr>
+            </w:r>
+            <w:r>
+              <w:rPr>
+                <w:sz w:val="19"/>
+              </w:rPr>
+              <w:t>1.15x</w:t>
+            </w:r>
+          </w:p>
+        </w:tc>
+      </w:tr>
+      <w:tr>
+        <w:tc>
+          <w:tcPr>
+            <w:tcW w:type="dxa" w:w="3168"/>
+          </w:tcPr>
+          <w:p>
+            <w:pPr>
+              <w:spacing w:after="40"/>
+            </w:pPr>
+            <w:r>
+              <w:rPr>
+                <w:sz w:val="19"/>
+              </w:rPr>
+            </w:r>
+            <w:r>
+              <w:rPr>
+                <w:sz w:val="19"/>
+              </w:rPr>
+              <w:t>Multi-agent, full (with debate)</w:t>
+            </w:r>
+          </w:p>
+        </w:tc>
+        <w:tc>
+          <w:tcPr>
+            <w:tcW w:type="dxa" w:w="1728"/>
+          </w:tcPr>
+          <w:p>
+            <w:pPr>
+              <w:spacing w:after="40"/>
+            </w:pPr>
+            <w:r>
+              <w:rPr>
+                <w:sz w:val="19"/>
+              </w:rPr>
+            </w:r>
+            <w:r>
+              <w:rPr>
+                <w:sz w:val="19"/>
+              </w:rPr>
+              <w:t>19,696.18</w:t>
+            </w:r>
+          </w:p>
+        </w:tc>
+        <w:tc>
+          <w:tcPr>
+            <w:tcW w:type="dxa" w:w="1440"/>
+          </w:tcPr>
+          <w:p>
+            <w:pPr>
+              <w:spacing w:after="40"/>
+            </w:pPr>
+            <w:r>
+              <w:rPr>
+                <w:sz w:val="19"/>
+              </w:rPr>
+            </w:r>
+            <w:r>
+              <w:rPr>
+                <w:sz w:val="19"/>
+              </w:rPr>
+              <w:t>9.0</w:t>
+            </w:r>
+          </w:p>
+        </w:tc>
+        <w:tc>
+          <w:tcPr>
+            <w:tcW w:type="dxa" w:w="1440"/>
+          </w:tcPr>
+          <w:p>
+            <w:pPr>
+              <w:spacing w:after="40"/>
+            </w:pPr>
+            <w:r>
+              <w:rPr>
+                <w:sz w:val="19"/>
+              </w:rPr>
+            </w:r>
+            <w:r>
+              <w:rPr>
+                <w:sz w:val="19"/>
+              </w:rPr>
+              <w:t>53.63s</w:t>
+            </w:r>
+          </w:p>
+        </w:tc>
+        <w:tc>
+          <w:tcPr>
+            <w:tcW w:type="dxa" w:w="1584"/>
+          </w:tcPr>
+          <w:p>
+            <w:pPr>
+              <w:spacing w:after="40"/>
+            </w:pPr>
+            <w:r>
+              <w:rPr>
+                <w:sz w:val="19"/>
+              </w:rPr>
+            </w:r>
+            <w:r>
+              <w:rPr>
+                <w:sz w:val="19"/>
+              </w:rPr>
+              <w:t>4.84x</w:t>
+            </w:r>
+          </w:p>
+        </w:tc>
+        <w:tc>
+          <w:tcPr>
+            <w:tcW w:type="dxa" w:w="1584"/>
+          </w:tcPr>
+          <w:p>
+            <w:pPr>
+              <w:spacing w:after="40"/>
+            </w:pPr>
+            <w:r>
+              <w:rPr>
+                <w:sz w:val="19"/>
+              </w:rPr>
+            </w:r>
+            <w:r>
+              <w:rPr>
+                <w:sz w:val="19"/>
+              </w:rPr>
+              <w:t>8.26x</w:t>
+            </w:r>
+          </w:p>
+        </w:tc>
+      </w:tr>
+    </w:tbl>
+    <w:p/>
     <w:p>
       <w:pPr>
         <w:spacing w:before="200" w:after="80"/>
@@ -3954,50 +5924,39 @@
           <w:color w:val="2E5C8A"/>
           <w:sz w:val="25"/>
         </w:rPr>
-        <w:t>6.7 Failure analysis</w:t>
+        <w:t>6.7 Calibration</w:t>
       </w:r>
     </w:p>
     <w:p>
-      <w:pPr>
-        <w:spacing w:before="120" w:after="160"/>
-        <w:ind w:left="216"/>
-        <w:shd w:val="clear" w:fill="E8F0FA"/>
-      </w:pPr>
+      <w:r>
+        <w:t xml:space="preserve">Calibration is scored with a Brier score and a reliability table binned by stated confidence. Full multi-agent with debate achieved a Brier score of </w:t>
+      </w:r>
       <w:r>
         <w:rPr>
           <w:b/>
         </w:rPr>
-        <w:t>PENDING — qualitative failure analysis requires scored LLM runs.</w:t>
+        <w:t>0.2593</w:t>
       </w:r>
       <w:r>
-        <w:t xml:space="preserve"> This table is generated from the committed files in </w:t>
+        <w:t xml:space="preserve"> (overconfidence gap 10.69 pts), improving calibration relative to single-LLM baseline (</w:t>
       </w:r>
       <w:r>
         <w:rPr>
-          <w:rFonts w:ascii="Consolas" w:hAnsi="Consolas"/>
-          <w:color w:val="2E5C8A"/>
-          <w:sz w:val="19"/>
+          <w:b/>
         </w:rPr>
-        <w:t>results/</w:t>
+        <w:t>0.2787</w:t>
       </w:r>
       <w:r>
-        <w:t xml:space="preserve">. The run has not been executed yet, so no numbers are shown rather than placeholder numbers. Re-run </w:t>
+        <w:t>, gap 18.23 pts) and multi-agent without debate (</w:t>
       </w:r>
       <w:r>
         <w:rPr>
-          <w:rFonts w:ascii="Consolas" w:hAnsi="Consolas"/>
-          <w:color w:val="2E5C8A"/>
-          <w:sz w:val="19"/>
+          <w:b/>
         </w:rPr>
-        <w:t>python -m scripts.make_thesis</w:t>
+        <w:t>0.2880</w:t>
       </w:r>
       <w:r>
-        <w:t xml:space="preserve"> after the experiment and this section fills itself.</w:t>
-      </w:r>
-    </w:p>
-    <w:p>
-      <w:r>
-        <w:t>The intended procedure: take 5–10 incorrect forecasts from the committed CSVs, read the specialist reports and debate transcript for each, and classify the cause — thin evidence, a specialist that dominated the synthesis, an over-confident risk officer, or a genuine market surprise no protocol could have anticipated. Every artefact needed for this is already persisted per run.</w:t>
+        <w:t>, gap 19.48 pts), and matching the 0.2500 uninformative reference floor.</w:t>
       </w:r>
     </w:p>
     <w:p/>
@@ -4019,7 +5978,30 @@
     </w:p>
     <w:p>
       <w:r>
-        <w:t>The engineering result stands independently of the experimental one: a complete, tested, leakage-free forecasting and evaluation pipeline exists, with every configuration reachable from one command. The experimental comparison is pending the scored runs described in §6.</w:t>
+        <w:t xml:space="preserve">Under the pre-registered decision rule, because the date-block clustered 95% confidence interval spans zero ([-4.41, +22.06] pts), the data support </w:t>
+      </w:r>
+      <w:r>
+        <w:rPr>
+          <w:b/>
+        </w:rPr>
+        <w:t>no supported difference</w:t>
+      </w:r>
+      <w:r>
+        <w:t xml:space="preserve"> in directional accuracy between the multi-agent system (50.00%) and the single-LLM baseline (41.18%). Similarly, the debate ablation demonstrates </w:t>
+      </w:r>
+      <w:r>
+        <w:rPr>
+          <w:b/>
+        </w:rPr>
+        <w:t>no supported difference</w:t>
+      </w:r>
+      <w:r>
+        <w:t xml:space="preserve"> in directional accuracy attributable to the debate stage (95% CI [-2.94, +13.24] pts, includes 0) while incurring a 2.14x token overhead. Under our pre-registered scientific commitment, point differences are strictly not described as improvements.</w:t>
+      </w:r>
+    </w:p>
+    <w:p>
+      <w:r>
+        <w:t>However, multi-agent debate and risk synthesis produced a marked descriptive reduction in model bias: it reduced unconditional bullish predictions from 97.06% (baseline) to 64.71% (multiagent), and reduced the overconfidence calibration gap from 18.23 points to 10.69 points, bringing the Brier score from 0.2787 to 0.2593.</w:t>
       </w:r>
     </w:p>
     <w:p>

</xml_diff>

<commit_message>
Fix thesis/slides wording, docs, limitations; minimal pinned requirements
</commit_message>
<xml_diff>
--- a/docs/BTP_Thesis_Report.docx
+++ b/docs/BTP_Thesis_Report.docx
@@ -37,7 +37,7 @@
           <w:color w:val="6B7280"/>
           <w:sz w:val="19"/>
         </w:rPr>
-        <w:t>B.Tech Capstone Project · Thesis Report · 18 October 2026</w:t>
+        <w:t>B.Tech Capstone Project · Thesis Report · 17 October 2026</w:t>
       </w:r>
     </w:p>
     <w:p/>
@@ -2887,7 +2887,7 @@
     </w:p>
     <w:p>
       <w:r>
-        <w:t>The probe asks the model for the NIFTY 50 close on specific dates and compares the answer to ground truth from the project's own data layer. Dates it can recall are inside the training window and are disqualified from the test set. Until it runs, the test window's post-cutoff status is argued rather than demonstrated, and this is stated as a limitation rather than glossed over.</w:t>
+        <w:t>The price probe asks the model for the NIFTY 50 close on specific dates. It was run on 33 dates between January 2024 and August 2026 and the model declined every one, so it cannot separate remembered from unknown periods and is reported as uninformative. A second, event-based probe asks for the RBI repo rate in force on each date: the model answered correctly for every probed date up to 2024-12-26 and declined for every later date, which matches the documented January 2025 knowledge cutoff. The event probe can only be scored through 2025-08-31 (5 of the 17 test dates), so the post-cutoff status of the test window rests mainly on the documented cutoff; this is stated as a limitation rather than glossed over.</w:t>
       </w:r>
     </w:p>
     <w:p>
@@ -4402,7 +4402,7 @@
         <w:t>Confirmatory Test (Pre-registered Decision Rule)</w:t>
       </w:r>
       <w:r>
-        <w:t xml:space="preserve">: Clustered uncertainty is estimated via date-block bootstrap (2,000 resamples of whole trading sessions), yielding a 95% confidence interval of </w:t>
+        <w:t xml:space="preserve">: Clustered uncertainty is estimated via date-block bootstrap (10,000 resamples of whole as_of dates), yielding a 95% confidence interval of </w:t>
       </w:r>
       <w:r>
         <w:rPr>
@@ -5938,7 +5938,7 @@
         <w:t>0.2593</w:t>
       </w:r>
       <w:r>
-        <w:t xml:space="preserve"> (overconfidence gap 10.69 pts), improving calibration relative to single-LLM baseline (</w:t>
+        <w:t xml:space="preserve"> (overconfidence gap 10.69 pts), against </w:t>
       </w:r>
       <w:r>
         <w:rPr>
@@ -5947,7 +5947,7 @@
         <w:t>0.2787</w:t>
       </w:r>
       <w:r>
-        <w:t>, gap 18.23 pts) and multi-agent without debate (</w:t>
+        <w:t xml:space="preserve"> for the single-LLM baseline (gap 18.23 pts) and </w:t>
       </w:r>
       <w:r>
         <w:rPr>
@@ -5956,7 +5956,7 @@
         <w:t>0.2880</w:t>
       </w:r>
       <w:r>
-        <w:t>, gap 19.48 pts), and matching the 0.2500 uninformative reference floor.</w:t>
+        <w:t xml:space="preserve"> for multi-agent without debate (gap 19.48 pts). Against the baseline the Brier difference is -0.019 (95% date-clustered CI [-0.047, +0.009]): no supported difference. Against no-debate it is -0.029 (CI [-0.053, -0.006]); this interval excludes zero, but it is a secondary, exploratory comparison among many and is not corrected for multiple testing, so it is reported as suggestive only. The multi-agent Brier score (95% CI [0.234, 0.282]) is statistically indistinguishable from the 0.2500 no-skill reference.</w:t>
       </w:r>
     </w:p>
     <w:p/>

</xml_diff>